<commit_message>
task132: realism rebuild after the leak reader (names, crews, service windows, cancellations, inspections, scopes, containers), world seed 147, answer 17 lots
Co-Authored-By: Claude Opus 5.5 <noreply@anthropic.com>
Claude-Session: https://claude.ai/code/session_01A6XcFx5t62c7gPi1bBKcVi
</commit_message>
<xml_diff>
--- a/task132/golden/psu_last_time_buy_memo.docx
+++ b/task132/golden/psu_last_time_buy_memo.docx
@@ -109,7 +109,7 @@
           <w:i w:val="0"/>
           <w:sz w:val="23"/>
         </w:rPr>
-        <w:t>Order 19 lots (475 modules) of VPR340-PSU-02 for CAD 933,375 before Veldtek's 15 December deadline.</w:t>
+        <w:t>Order 17 lots (425 modules) of VPR340-PSU-02 for CAD 835,125 before Veldtek's 15 December deadline.</w:t>
       </w:r>
     </w:p>
     <w:p>
@@ -121,7 +121,7 @@
           <w:b w:val="0"/>
           <w:i w:val="0"/>
         </w:rPr>
-        <w:t>With the 39 modules we can use today, 19 lots give a 98.3 per cent chance of covering every power supply failure until the renewal programme reaches each substation, against the 95 per cent AM-PC-014 asks for. 18 lots fall short at 84.2 per cent. We expect 467.8 failures between October 2026 and the end of support, most of them in 2027 to 2031 while the fleet is still large and ageing into its wear-out years.</w:t>
+        <w:t>With the 29 modules we can use today, 17 lots give a 98.9 per cent chance of covering every power supply failure until the renewal programme reaches each substation, against the 95 per cent AM-PC-014 asks for. 16 lots fall short at 86.2 per cent. We expect 407.5 failures between October 2026 and the end of support, most of them in 2027 to 2031 while the fleet is still large and ageing into its wear-out years.</w:t>
       </w:r>
     </w:p>
     <w:p>
@@ -292,6 +292,160 @@
                 <w:b w:val="0"/>
                 <w:sz w:val="18"/>
               </w:rPr>
+              <w:t>13</w:t>
+            </w:r>
+          </w:p>
+        </w:tc>
+        <w:tc>
+          <w:tcPr>
+            <w:tcW w:type="dxa" w:w="2408"/>
+          </w:tcPr>
+          <w:p>
+            <w:pPr>
+              <w:spacing w:after="0"/>
+              <w:jc w:val="right"/>
+            </w:pPr>
+            <w:r/>
+            <w:r>
+              <w:rPr>
+                <w:b w:val="0"/>
+                <w:sz w:val="18"/>
+              </w:rPr>
+              <w:t>354</w:t>
+            </w:r>
+          </w:p>
+        </w:tc>
+        <w:tc>
+          <w:tcPr>
+            <w:tcW w:type="dxa" w:w="2408"/>
+          </w:tcPr>
+          <w:p>
+            <w:pPr>
+              <w:spacing w:after="0"/>
+              <w:jc w:val="right"/>
+            </w:pPr>
+            <w:r/>
+            <w:r>
+              <w:rPr>
+                <w:b w:val="0"/>
+                <w:sz w:val="18"/>
+              </w:rPr>
+              <w:t>0.4</w:t>
+            </w:r>
+          </w:p>
+        </w:tc>
+        <w:tc>
+          <w:tcPr>
+            <w:tcW w:type="dxa" w:w="2408"/>
+          </w:tcPr>
+          <w:p>
+            <w:pPr>
+              <w:spacing w:after="0"/>
+              <w:jc w:val="right"/>
+            </w:pPr>
+            <w:r/>
+            <w:r>
+              <w:rPr>
+                <w:b w:val="0"/>
+                <w:sz w:val="18"/>
+              </w:rPr>
+              <w:t>638,625</w:t>
+            </w:r>
+          </w:p>
+        </w:tc>
+      </w:tr>
+      <w:tr>
+        <w:tc>
+          <w:tcPr>
+            <w:tcW w:type="dxa" w:w="2408"/>
+          </w:tcPr>
+          <w:p>
+            <w:pPr>
+              <w:spacing w:after="0"/>
+            </w:pPr>
+            <w:r/>
+            <w:r>
+              <w:rPr>
+                <w:b w:val="0"/>
+                <w:sz w:val="18"/>
+              </w:rPr>
+              <w:t>14</w:t>
+            </w:r>
+          </w:p>
+        </w:tc>
+        <w:tc>
+          <w:tcPr>
+            <w:tcW w:type="dxa" w:w="2408"/>
+          </w:tcPr>
+          <w:p>
+            <w:pPr>
+              <w:spacing w:after="0"/>
+              <w:jc w:val="right"/>
+            </w:pPr>
+            <w:r/>
+            <w:r>
+              <w:rPr>
+                <w:b w:val="0"/>
+                <w:sz w:val="18"/>
+              </w:rPr>
+              <w:t>379</w:t>
+            </w:r>
+          </w:p>
+        </w:tc>
+        <w:tc>
+          <w:tcPr>
+            <w:tcW w:type="dxa" w:w="2408"/>
+          </w:tcPr>
+          <w:p>
+            <w:pPr>
+              <w:spacing w:after="0"/>
+              <w:jc w:val="right"/>
+            </w:pPr>
+            <w:r/>
+            <w:r>
+              <w:rPr>
+                <w:b w:val="0"/>
+                <w:sz w:val="18"/>
+              </w:rPr>
+              <w:t>8.2</w:t>
+            </w:r>
+          </w:p>
+        </w:tc>
+        <w:tc>
+          <w:tcPr>
+            <w:tcW w:type="dxa" w:w="2408"/>
+          </w:tcPr>
+          <w:p>
+            <w:pPr>
+              <w:spacing w:after="0"/>
+              <w:jc w:val="right"/>
+            </w:pPr>
+            <w:r/>
+            <w:r>
+              <w:rPr>
+                <w:b w:val="0"/>
+                <w:sz w:val="18"/>
+              </w:rPr>
+              <w:t>687,750</w:t>
+            </w:r>
+          </w:p>
+        </w:tc>
+      </w:tr>
+      <w:tr>
+        <w:tc>
+          <w:tcPr>
+            <w:tcW w:type="dxa" w:w="2408"/>
+          </w:tcPr>
+          <w:p>
+            <w:pPr>
+              <w:spacing w:after="0"/>
+            </w:pPr>
+            <w:r/>
+            <w:r>
+              <w:rPr>
+                <w:b w:val="0"/>
+                <w:sz w:val="18"/>
+              </w:rPr>
               <w:t>15</w:t>
             </w:r>
           </w:p>
@@ -311,7 +465,7 @@
                 <w:b w:val="0"/>
                 <w:sz w:val="18"/>
               </w:rPr>
-              <w:t>414</w:t>
+              <w:t>404</w:t>
             </w:r>
           </w:p>
         </w:tc>
@@ -330,7 +484,7 @@
                 <w:b w:val="0"/>
                 <w:sz w:val="18"/>
               </w:rPr>
-              <w:t>0.6</w:t>
+              <w:t>44.5</w:t>
             </w:r>
           </w:p>
         </w:tc>
@@ -388,7 +542,7 @@
                 <w:b w:val="0"/>
                 <w:sz w:val="18"/>
               </w:rPr>
-              <w:t>439</w:t>
+              <w:t>429</w:t>
             </w:r>
           </w:p>
         </w:tc>
@@ -407,7 +561,7 @@
                 <w:b w:val="0"/>
                 <w:sz w:val="18"/>
               </w:rPr>
-              <w:t>9.4</w:t>
+              <w:t>86.2</w:t>
             </w:r>
           </w:p>
         </w:tc>
@@ -443,7 +597,7 @@
             <w:r/>
             <w:r>
               <w:rPr>
-                <w:b w:val="0"/>
+                <w:b/>
                 <w:sz w:val="18"/>
               </w:rPr>
               <w:t>17</w:t>
@@ -462,10 +616,10 @@
             <w:r/>
             <w:r>
               <w:rPr>
-                <w:b w:val="0"/>
+                <w:b/>
                 <w:sz w:val="18"/>
               </w:rPr>
-              <w:t>464</w:t>
+              <w:t>454</w:t>
             </w:r>
           </w:p>
         </w:tc>
@@ -481,10 +635,10 @@
             <w:r/>
             <w:r>
               <w:rPr>
-                <w:b w:val="0"/>
+                <w:b/>
                 <w:sz w:val="18"/>
               </w:rPr>
-              <w:t>44.2</w:t>
+              <w:t>98.9</w:t>
             </w:r>
           </w:p>
         </w:tc>
@@ -500,7 +654,7 @@
             <w:r/>
             <w:r>
               <w:rPr>
-                <w:b w:val="0"/>
+                <w:b/>
                 <w:sz w:val="18"/>
               </w:rPr>
               <w:t>835,125</w:t>
@@ -542,238 +696,7 @@
                 <w:b w:val="0"/>
                 <w:sz w:val="18"/>
               </w:rPr>
-              <w:t>489</w:t>
-            </w:r>
-          </w:p>
-        </w:tc>
-        <w:tc>
-          <w:tcPr>
-            <w:tcW w:type="dxa" w:w="2408"/>
-          </w:tcPr>
-          <w:p>
-            <w:pPr>
-              <w:spacing w:after="0"/>
-              <w:jc w:val="right"/>
-            </w:pPr>
-            <w:r/>
-            <w:r>
-              <w:rPr>
-                <w:b w:val="0"/>
-                <w:sz w:val="18"/>
-              </w:rPr>
-              <w:t>84.2</w:t>
-            </w:r>
-          </w:p>
-        </w:tc>
-        <w:tc>
-          <w:tcPr>
-            <w:tcW w:type="dxa" w:w="2408"/>
-          </w:tcPr>
-          <w:p>
-            <w:pPr>
-              <w:spacing w:after="0"/>
-              <w:jc w:val="right"/>
-            </w:pPr>
-            <w:r/>
-            <w:r>
-              <w:rPr>
-                <w:b w:val="0"/>
-                <w:sz w:val="18"/>
-              </w:rPr>
-              <w:t>884,250</w:t>
-            </w:r>
-          </w:p>
-        </w:tc>
-      </w:tr>
-      <w:tr>
-        <w:tc>
-          <w:tcPr>
-            <w:tcW w:type="dxa" w:w="2408"/>
-          </w:tcPr>
-          <w:p>
-            <w:pPr>
-              <w:spacing w:after="0"/>
-            </w:pPr>
-            <w:r/>
-            <w:r>
-              <w:rPr>
-                <w:b/>
-                <w:sz w:val="18"/>
-              </w:rPr>
-              <w:t>19</w:t>
-            </w:r>
-          </w:p>
-        </w:tc>
-        <w:tc>
-          <w:tcPr>
-            <w:tcW w:type="dxa" w:w="2408"/>
-          </w:tcPr>
-          <w:p>
-            <w:pPr>
-              <w:spacing w:after="0"/>
-              <w:jc w:val="right"/>
-            </w:pPr>
-            <w:r/>
-            <w:r>
-              <w:rPr>
-                <w:b/>
-                <w:sz w:val="18"/>
-              </w:rPr>
-              <w:t>514</w:t>
-            </w:r>
-          </w:p>
-        </w:tc>
-        <w:tc>
-          <w:tcPr>
-            <w:tcW w:type="dxa" w:w="2408"/>
-          </w:tcPr>
-          <w:p>
-            <w:pPr>
-              <w:spacing w:after="0"/>
-              <w:jc w:val="right"/>
-            </w:pPr>
-            <w:r/>
-            <w:r>
-              <w:rPr>
-                <w:b/>
-                <w:sz w:val="18"/>
-              </w:rPr>
-              <w:t>98.3</w:t>
-            </w:r>
-          </w:p>
-        </w:tc>
-        <w:tc>
-          <w:tcPr>
-            <w:tcW w:type="dxa" w:w="2408"/>
-          </w:tcPr>
-          <w:p>
-            <w:pPr>
-              <w:spacing w:after="0"/>
-              <w:jc w:val="right"/>
-            </w:pPr>
-            <w:r/>
-            <w:r>
-              <w:rPr>
-                <w:b/>
-                <w:sz w:val="18"/>
-              </w:rPr>
-              <w:t>933,375</w:t>
-            </w:r>
-          </w:p>
-        </w:tc>
-      </w:tr>
-      <w:tr>
-        <w:tc>
-          <w:tcPr>
-            <w:tcW w:type="dxa" w:w="2408"/>
-          </w:tcPr>
-          <w:p>
-            <w:pPr>
-              <w:spacing w:after="0"/>
-            </w:pPr>
-            <w:r/>
-            <w:r>
-              <w:rPr>
-                <w:b w:val="0"/>
-                <w:sz w:val="18"/>
-              </w:rPr>
-              <w:t>20</w:t>
-            </w:r>
-          </w:p>
-        </w:tc>
-        <w:tc>
-          <w:tcPr>
-            <w:tcW w:type="dxa" w:w="2408"/>
-          </w:tcPr>
-          <w:p>
-            <w:pPr>
-              <w:spacing w:after="0"/>
-              <w:jc w:val="right"/>
-            </w:pPr>
-            <w:r/>
-            <w:r>
-              <w:rPr>
-                <w:b w:val="0"/>
-                <w:sz w:val="18"/>
-              </w:rPr>
-              <w:t>539</w:t>
-            </w:r>
-          </w:p>
-        </w:tc>
-        <w:tc>
-          <w:tcPr>
-            <w:tcW w:type="dxa" w:w="2408"/>
-          </w:tcPr>
-          <w:p>
-            <w:pPr>
-              <w:spacing w:after="0"/>
-              <w:jc w:val="right"/>
-            </w:pPr>
-            <w:r/>
-            <w:r>
-              <w:rPr>
-                <w:b w:val="0"/>
-                <w:sz w:val="18"/>
-              </w:rPr>
-              <w:t>99.9</w:t>
-            </w:r>
-          </w:p>
-        </w:tc>
-        <w:tc>
-          <w:tcPr>
-            <w:tcW w:type="dxa" w:w="2408"/>
-          </w:tcPr>
-          <w:p>
-            <w:pPr>
-              <w:spacing w:after="0"/>
-              <w:jc w:val="right"/>
-            </w:pPr>
-            <w:r/>
-            <w:r>
-              <w:rPr>
-                <w:b w:val="0"/>
-                <w:sz w:val="18"/>
-              </w:rPr>
-              <w:t>982,500</w:t>
-            </w:r>
-          </w:p>
-        </w:tc>
-      </w:tr>
-      <w:tr>
-        <w:tc>
-          <w:tcPr>
-            <w:tcW w:type="dxa" w:w="2408"/>
-          </w:tcPr>
-          <w:p>
-            <w:pPr>
-              <w:spacing w:after="0"/>
-            </w:pPr>
-            <w:r/>
-            <w:r>
-              <w:rPr>
-                <w:b w:val="0"/>
-                <w:sz w:val="18"/>
-              </w:rPr>
-              <w:t>21</w:t>
-            </w:r>
-          </w:p>
-        </w:tc>
-        <w:tc>
-          <w:tcPr>
-            <w:tcW w:type="dxa" w:w="2408"/>
-          </w:tcPr>
-          <w:p>
-            <w:pPr>
-              <w:spacing w:after="0"/>
-              <w:jc w:val="right"/>
-            </w:pPr>
-            <w:r/>
-            <w:r>
-              <w:rPr>
-                <w:b w:val="0"/>
-                <w:sz w:val="18"/>
-              </w:rPr>
-              <w:t>564</w:t>
+              <w:t>479</w:t>
             </w:r>
           </w:p>
         </w:tc>
@@ -811,7 +734,84 @@
                 <w:b w:val="0"/>
                 <w:sz w:val="18"/>
               </w:rPr>
-              <w:t>1,031,625</w:t>
+              <w:t>884,250</w:t>
+            </w:r>
+          </w:p>
+        </w:tc>
+      </w:tr>
+      <w:tr>
+        <w:tc>
+          <w:tcPr>
+            <w:tcW w:type="dxa" w:w="2408"/>
+          </w:tcPr>
+          <w:p>
+            <w:pPr>
+              <w:spacing w:after="0"/>
+            </w:pPr>
+            <w:r/>
+            <w:r>
+              <w:rPr>
+                <w:b w:val="0"/>
+                <w:sz w:val="18"/>
+              </w:rPr>
+              <w:t>19</w:t>
+            </w:r>
+          </w:p>
+        </w:tc>
+        <w:tc>
+          <w:tcPr>
+            <w:tcW w:type="dxa" w:w="2408"/>
+          </w:tcPr>
+          <w:p>
+            <w:pPr>
+              <w:spacing w:after="0"/>
+              <w:jc w:val="right"/>
+            </w:pPr>
+            <w:r/>
+            <w:r>
+              <w:rPr>
+                <w:b w:val="0"/>
+                <w:sz w:val="18"/>
+              </w:rPr>
+              <w:t>504</w:t>
+            </w:r>
+          </w:p>
+        </w:tc>
+        <w:tc>
+          <w:tcPr>
+            <w:tcW w:type="dxa" w:w="2408"/>
+          </w:tcPr>
+          <w:p>
+            <w:pPr>
+              <w:spacing w:after="0"/>
+              <w:jc w:val="right"/>
+            </w:pPr>
+            <w:r/>
+            <w:r>
+              <w:rPr>
+                <w:b w:val="0"/>
+                <w:sz w:val="18"/>
+              </w:rPr>
+              <w:t>100.0</w:t>
+            </w:r>
+          </w:p>
+        </w:tc>
+        <w:tc>
+          <w:tcPr>
+            <w:tcW w:type="dxa" w:w="2408"/>
+          </w:tcPr>
+          <w:p>
+            <w:pPr>
+              <w:spacing w:after="0"/>
+              <w:jc w:val="right"/>
+            </w:pPr>
+            <w:r/>
+            <w:r>
+              <w:rPr>
+                <w:b w:val="0"/>
+                <w:sz w:val="18"/>
+              </w:rPr>
+              <w:t>933,375</w:t>
             </w:r>
           </w:p>
         </w:tc>
@@ -838,7 +838,7 @@
           <w:i w:val="0"/>
           <w:sz w:val="19"/>
         </w:rPr>
-        <w:t>Available modules are the 36 serviceable at Central Stores and the two depots plus the 3 at Veldtek under open RMA, which the notice says will come back repaired; the 7 in quarantine are left out until they pass bench test. The workbook vpr340_psu_final_buy.xlsx carries the settings, the outlook by year and region, and the band rates.</w:t>
+        <w:t>Available modules are the 23 serviceable at Central Stores and the two depots plus the 6 at Veldtek under open RMA, which the notice says will come back repaired; the 7 in quarantine are left out until they pass bench test. The workbook vpr340_psu_final_buy.xlsx carries the settings, the outlook by year and region, and the band rates.</w:t>
       </w:r>
     </w:p>
     <w:p>

</xml_diff>

<commit_message>
task132 realism repair 2: failure and stock tie-out, procedure definitions table, program scope off the register, crew text, a fuller extract, master data, RMA history, containers and Canadian spelling; answer still 13 lots, expected failures 298.9
Co-Authored-By: Claude Opus 5.5 <noreply@anthropic.com>
Claude-Session: https://claude.ai/code/session_01A6XcFx5t62c7gPi1bBKcVi
</commit_message>
<xml_diff>
--- a/task132/golden/psu_last_time_buy_memo.docx
+++ b/task132/golden/psu_last_time_buy_memo.docx
@@ -108,7 +108,7 @@
         <w:spacing w:after="120"/>
       </w:pPr>
       <w:r>
-        <w:t>With the 14 modules we can use today, 13 lots give a 99.1 per cent chance of covering every power supply failure until the renewal programme reaches each relay, against the 95 per cent AM-PC-014 asks for; 12 lots would give 83.2 per cent. We expect 297.9 failures between October 2026 and the end of support, most of them in 2027 to 2031 while the fleet is still large.</w:t>
+        <w:t>With the 15 modules we can use today, 13 lots give a 99.1 per cent chance of covering every power supply failure until the renewal program reaches each relay, against the 95 per cent AM-PC-014 asks for; 12 lots would give 83.2 per cent. We expect 298.9 failures between October 2026 and the end of support, most of them in 2027 to 2031 while the fleet is still large.</w:t>
       </w:r>
     </w:p>
     <w:p>
@@ -116,7 +116,7 @@
         <w:spacing w:after="120"/>
       </w:pPr>
       <w:r>
-        <w:t>How the figure is built. Rates are set for the AM-PC-014 module age bands from the PSU failures in the EAM history since January 2021, over the module-years each band has been in service since then; the 25-and-over band fails about a quarter of its modules a year. Each relay's present module is then aged month by month until the programme reaches its bay. A module that fails comes out and its replacement from this buy starts again in the 0-9 band, where failures are rare, so the old module's rate only applies for as long as it is likely to still be there.</w:t>
+        <w:t>How the figure is built. Rates are set for the AM-PC-014 module age bands from the PSU failures in the EAM history since January 2021, over the module-years each band has been in service since then; the 25-and-over band fails about a quarter of its modules a year. Each relay's present module is then aged month by month until the program reaches its bay. A module that fails comes out and its replacement from this buy starts again in the 0-9 band, where failures are rare, so the old module's rate only applies for as long as it is likely to still be there.</w:t>
       </w:r>
     </w:p>
     <w:p>
@@ -285,7 +285,7 @@
               <w:rPr>
                 <w:sz w:val="18"/>
               </w:rPr>
-              <w:t>314</w:t>
+              <w:t>315</w:t>
             </w:r>
           </w:p>
         </w:tc>
@@ -356,7 +356,7 @@
                 <w:b/>
                 <w:sz w:val="18"/>
               </w:rPr>
-              <w:t>339</w:t>
+              <w:t>340</w:t>
             </w:r>
           </w:p>
         </w:tc>
@@ -427,7 +427,7 @@
               <w:rPr>
                 <w:sz w:val="18"/>
               </w:rPr>
-              <w:t>364</w:t>
+              <w:t>365</w:t>
             </w:r>
           </w:p>
         </w:tc>
@@ -480,7 +480,7 @@
         <w:rPr>
           <w:sz w:val="19"/>
         </w:rPr>
-        <w:t>Available modules are the 12 serviceable at Central Stores and the two depots plus the 2 at Veldtek under open RMA, which the notice says will come back repaired; the 7 in quarantine are left out until they pass bench test. The workbook vpr340_psu_final_buy.xlsx carries every order from 8 to 22 lots, the outlook by year and region, and the band rates.</w:t>
+        <w:t>Available modules are the 12 serviceable at Central Stores and the two depots plus the 3 at Veldtek under open RMA, which the notice says will come back repaired; the 7 in quarantine are left out until they pass bench test. The workbook vpr340_psu_final_buy.xlsx carries every order from 8 to 22 lots, the outlook by year and region, and the band rates.</w:t>
       </w:r>
     </w:p>
     <w:p>

</xml_diff>

<commit_message>
task132 realism repair 3: exposure window and end of support pinned, early-life and random failures with warranty returns, rebuild modules scrapped under e-waste manifests, procedure history from first issue, crew text, EAM residue, late-2026 commissionings, LibreOffice EOL notice, fixed-decimal CSVs and Excel caches; answer still 13 lots (298.6 expected failures), no-renewal stump 19 lots
Co-Authored-By: Claude Opus 5.5 <noreply@anthropic.com>
Claude-Session: https://claude.ai/code/session_01A6XcFx5t62c7gPi1bBKcVi
</commit_message>
<xml_diff>
--- a/task132/golden/psu_last_time_buy_memo.docx
+++ b/task132/golden/psu_last_time_buy_memo.docx
@@ -108,7 +108,7 @@
         <w:spacing w:after="120"/>
       </w:pPr>
       <w:r>
-        <w:t>With the 15 modules we can use today, 13 lots give a 99.1 per cent chance of covering every power supply failure until the renewal program reaches each relay, against the 95 per cent AM-PC-014 asks for; 12 lots would give 83.2 per cent. We expect 298.9 failures between October 2026 and the end of support, most of them in 2027 to 2031 while the fleet is still large.</w:t>
+        <w:t>With the 15 modules we can use today, 13 lots give a 99.1 per cent chance of covering every power supply failure until the renewal program reaches each relay, against the 95 per cent AM-PC-014 asks for; 12 lots would give 83.6 per cent. We expect 298.6 failures between October 2026 and the end of support, more than half of them by the end of 2030 while the fleet is still large.</w:t>
       </w:r>
     </w:p>
     <w:p>
@@ -116,7 +116,7 @@
         <w:spacing w:after="120"/>
       </w:pPr>
       <w:r>
-        <w:t>How the figure is built. Rates are set for the AM-PC-014 module age bands from the PSU failures in the EAM history since January 2021, over the module-years each band has been in service since then; the 25-and-over band fails about a quarter of its modules a year. Each relay's present module is then aged month by month until the program reaches its bay. A module that fails comes out and its replacement from this buy starts again in the 0-9 band, where failures are rare, so the old module's rate only applies for as long as it is likely to still be there.</w:t>
+        <w:t>How the figure is built. Rates are set for the AM-PC-014 module age bands from the PSU failures in the EAM history since January 2021, over the module-years each band has been in service since then; the 25-and-over band loses about one module in 3 a year, the 0-9 band about one in 190. Each relay's present module is then aged month by month until the program reaches its bay. A module that fails comes out and its replacement from this buy starts again in the 0-9 band, so the old module's rate only applies for as long as it is likely to still be there.</w:t>
       </w:r>
     </w:p>
     <w:p>
@@ -302,7 +302,7 @@
               <w:rPr>
                 <w:sz w:val="18"/>
               </w:rPr>
-              <w:t>83.2</w:t>
+              <w:t>83.6</w:t>
             </w:r>
           </w:p>
         </w:tc>

</xml_diff>